<commit_message>
update cv =  certificates links
</commit_message>
<xml_diff>
--- a/Resume/Ali_Tavousi_CV.docx
+++ b/Resume/Ali_Tavousi_CV.docx
@@ -45,8 +45,139 @@
           <w:color w:val="0E7C86"/>
           <w:sz w:val="24"/>
           <w:szCs w:val="24"/>
-        </w:rPr>
-        <w:t>Front-End Developer</w:t>
+          <w14:textFill>
+            <w14:gradFill>
+              <w14:gsLst>
+                <w14:gs w14:pos="0">
+                  <w14:srgbClr w14:val="0E7C86">
+                    <w14:shade w14:val="30000"/>
+                    <w14:satMod w14:val="115000"/>
+                  </w14:srgbClr>
+                </w14:gs>
+                <w14:gs w14:pos="50000">
+                  <w14:srgbClr w14:val="0E7C86">
+                    <w14:shade w14:val="67500"/>
+                    <w14:satMod w14:val="115000"/>
+                  </w14:srgbClr>
+                </w14:gs>
+                <w14:gs w14:pos="100000">
+                  <w14:srgbClr w14:val="0E7C86">
+                    <w14:shade w14:val="100000"/>
+                    <w14:satMod w14:val="115000"/>
+                  </w14:srgbClr>
+                </w14:gs>
+              </w14:gsLst>
+              <w14:path w14:path="circle">
+                <w14:fillToRect w14:l="50000" w14:t="50000" w14:r="50000" w14:b="50000"/>
+              </w14:path>
+            </w14:gradFill>
+          </w14:textFill>
+        </w:rPr>
+        <w:t>Front</w:t>
+      </w:r>
+      <w:r>
+        <w:rPr>
+          <w:b/>
+          <w:bCs/>
+          <w:color w:val="0E7C86"/>
+          <w:sz w:val="24"/>
+          <w:szCs w:val="24"/>
+        </w:rPr>
+        <w:t>-E</w:t>
+      </w:r>
+      <w:r>
+        <w:rPr>
+          <w:b/>
+          <w:bCs/>
+          <w:color w:val="0E7C86"/>
+          <w:sz w:val="24"/>
+          <w:szCs w:val="24"/>
+          <w14:textFill>
+            <w14:gradFill>
+              <w14:gsLst>
+                <w14:gs w14:pos="0">
+                  <w14:srgbClr w14:val="0E7C86">
+                    <w14:shade w14:val="30000"/>
+                    <w14:satMod w14:val="115000"/>
+                  </w14:srgbClr>
+                </w14:gs>
+                <w14:gs w14:pos="50000">
+                  <w14:srgbClr w14:val="0E7C86">
+                    <w14:shade w14:val="67500"/>
+                    <w14:satMod w14:val="115000"/>
+                  </w14:srgbClr>
+                </w14:gs>
+                <w14:gs w14:pos="100000">
+                  <w14:srgbClr w14:val="0E7C86">
+                    <w14:shade w14:val="100000"/>
+                    <w14:satMod w14:val="115000"/>
+                  </w14:srgbClr>
+                </w14:gs>
+              </w14:gsLst>
+              <w14:path w14:path="circle">
+                <w14:fillToRect w14:l="50000" w14:t="50000" w14:r="50000" w14:b="50000"/>
+              </w14:path>
+            </w14:gradFill>
+          </w14:textFill>
+        </w:rPr>
+        <w:t xml:space="preserve">nd </w:t>
+      </w:r>
+      <w:r>
+        <w:rPr>
+          <w:b/>
+          <w:bCs/>
+          <w:color w:val="0E7C86"/>
+          <w:sz w:val="24"/>
+          <w:szCs w:val="24"/>
+        </w:rPr>
+        <w:t>D</w:t>
+      </w:r>
+      <w:r>
+        <w:rPr>
+          <w:b/>
+          <w:bCs/>
+          <w:color w:val="0E7C86"/>
+          <w:sz w:val="24"/>
+          <w:szCs w:val="24"/>
+          <w14:textFill>
+            <w14:gradFill>
+              <w14:gsLst>
+                <w14:gs w14:pos="0">
+                  <w14:srgbClr w14:val="0E7C86">
+                    <w14:shade w14:val="30000"/>
+                    <w14:satMod w14:val="115000"/>
+                  </w14:srgbClr>
+                </w14:gs>
+                <w14:gs w14:pos="50000">
+                  <w14:srgbClr w14:val="0E7C86">
+                    <w14:shade w14:val="67500"/>
+                    <w14:satMod w14:val="115000"/>
+                  </w14:srgbClr>
+                </w14:gs>
+                <w14:gs w14:pos="100000">
+                  <w14:srgbClr w14:val="0E7C86">
+                    <w14:shade w14:val="100000"/>
+                    <w14:satMod w14:val="115000"/>
+                  </w14:srgbClr>
+                </w14:gs>
+              </w14:gsLst>
+              <w14:path w14:path="circle">
+                <w14:fillToRect w14:l="100000" w14:t="100000" w14:r="0" w14:b="0"/>
+              </w14:path>
+            </w14:gradFill>
+          </w14:textFill>
+        </w:rPr>
+        <w:t>evelop</w:t>
+      </w:r>
+      <w:r>
+        <w:rPr>
+          <w:b/>
+          <w:bCs/>
+          <w:color w:val="0E7C86"/>
+          <w:sz w:val="24"/>
+          <w:szCs w:val="24"/>
+        </w:rPr>
+        <w:t>er</w:t>
       </w:r>
     </w:p>
     <w:p>
@@ -56,35 +187,32 @@
       <w:r>
         <w:t xml:space="preserve">Isfahan, Iran  |  +98 916 293 2329  |  </w:t>
       </w:r>
-      <w:hyperlink r:id="rId5">
+      <w:hyperlink r:id="rId5" w:history="1">
         <w:r>
           <w:rPr>
-            <w:color w:val="0E7C86"/>
-            <w:u w:val="single"/>
+            <w:rStyle w:val="Hyperlink"/>
           </w:rPr>
           <w:t>Alitavousi83@gmail.com</w:t>
         </w:r>
       </w:hyperlink>
       <w:r>
-        <w:t xml:space="preserve">  |  </w:t>
-      </w:r>
-      <w:hyperlink r:id="rId6">
+        <w:t xml:space="preserve"> | </w:t>
+      </w:r>
+      <w:hyperlink r:id="rId6" w:history="1">
         <w:r>
           <w:rPr>
-            <w:color w:val="0E7C86"/>
-            <w:u w:val="single"/>
+            <w:rStyle w:val="Hyperlink"/>
           </w:rPr>
           <w:t>linkedin.com/in/alitavousi83</w:t>
         </w:r>
       </w:hyperlink>
       <w:r>
-        <w:t xml:space="preserve">  |  </w:t>
-      </w:r>
-      <w:hyperlink r:id="rId7">
+        <w:t xml:space="preserve">|  </w:t>
+      </w:r>
+      <w:hyperlink r:id="rId7" w:history="1">
         <w:r>
           <w:rPr>
-            <w:color w:val="0E7C86"/>
-            <w:u w:val="single"/>
+            <w:rStyle w:val="Hyperlink"/>
           </w:rPr>
           <w:t>github.com/alitavousi83</w:t>
         </w:r>
@@ -111,10 +239,7 @@
     </w:p>
     <w:p>
       <w:r>
-        <w:t xml:space="preserve">Front-end developer who builds responsive, mobile-friendly websites with HTML5, CSS3, JavaScript (ES6+), and Bootstrap, managing all work through Git and GitHub. </w:t>
-      </w:r>
-      <w:r>
-        <w:t xml:space="preserve">Completed a Six-month C++ internship at </w:t>
+        <w:t xml:space="preserve">Front-end developer who builds responsive, mobile-friendly websites with HTML5, CSS3, JavaScript (ES6+), and Bootstrap, managing all work through Git and GitHub. Completed a Six-month C++ internship at </w:t>
       </w:r>
       <w:proofErr w:type="spellStart"/>
       <w:r>
@@ -130,10 +255,7 @@
       </w:r>
       <w:proofErr w:type="spellEnd"/>
       <w:r>
-        <w:t xml:space="preserve"> that established disciplined debugging, code-review, and problem-solving habits. and accredited certifications in web design, advanced CSS, and JavaScript. Currently focused on building respons</w:t>
-      </w:r>
-      <w:r>
-        <w:t xml:space="preserve">ive web applications with modern JavaScript while continuing to expand my front-end development skills. </w:t>
+        <w:t xml:space="preserve"> that established disciplined debugging, code-review, and problem-solving habits. and accredited certifications in web design, advanced CSS, and JavaScript. Currently focused on building responsive web applications with modern JavaScript while continuing to expand my front-end development skills. </w:t>
       </w:r>
     </w:p>
     <w:p>
@@ -184,10 +306,7 @@
         <w:t xml:space="preserve">Programming Languages:  </w:t>
       </w:r>
       <w:r>
-        <w:t>Java</w:t>
-      </w:r>
-      <w:r>
-        <w:t>Script (ES6+), C++, MATLAB</w:t>
+        <w:t>JavaScript (ES6+), C++, MATLAB</w:t>
       </w:r>
     </w:p>
     <w:p>
@@ -283,27 +402,15 @@
         </w:rPr>
         <w:t xml:space="preserve"> — Intercity Ride-Booking Website    </w:t>
       </w:r>
-      <w:hyperlink r:id="rId8">
+      <w:hyperlink r:id="rId8" w:history="1">
         <w:r>
           <w:rPr>
-            <w:color w:val="0E7C86"/>
+            <w:rStyle w:val="Hyperlink"/>
             <w:sz w:val="18"/>
             <w:szCs w:val="18"/>
-            <w:u w:val="single"/>
           </w:rPr>
-          <w:t>github.com/alitavousi83/</w:t>
+          <w:t>https://alitavousi83.github.io/RideXpress/</w:t>
         </w:r>
-        <w:proofErr w:type="spellStart"/>
-        <w:r>
-          <w:rPr>
-            <w:color w:val="0E7C86"/>
-            <w:sz w:val="18"/>
-            <w:szCs w:val="18"/>
-            <w:u w:val="single"/>
-          </w:rPr>
-          <w:t>RideXpress</w:t>
-        </w:r>
-        <w:proofErr w:type="spellEnd"/>
       </w:hyperlink>
     </w:p>
     <w:p>
@@ -343,10 +450,7 @@
         <w:ind w:left="283"/>
       </w:pPr>
       <w:r>
-        <w:t>Used CSS custom properties to k</w:t>
-      </w:r>
-      <w:r>
-        <w:t>eep colors, spacing, and typography consistent and maintainable across all pages.</w:t>
+        <w:t>Used CSS custom properties to keep colors, spacing, and typography consistent and maintainable across all pages.</w:t>
       </w:r>
     </w:p>
     <w:p>
@@ -366,10 +470,7 @@
         <w:ind w:left="283"/>
       </w:pPr>
       <w:r>
-        <w:t>Implemented interactive features in vanilla JavaScript (ES6+): DOM manipulation for dynamic, filterable announcement cards, client-side form validation with regular-expressio</w:t>
-      </w:r>
-      <w:r>
-        <w:t xml:space="preserve">n phone-number checks, and </w:t>
+        <w:t xml:space="preserve">Implemented interactive features in vanilla JavaScript (ES6+): DOM manipulation for dynamic, filterable announcement cards, client-side form validation with regular-expression phone-number checks, and </w:t>
       </w:r>
       <w:proofErr w:type="spellStart"/>
       <w:r>
@@ -521,10 +622,7 @@
         <w:ind w:left="283"/>
       </w:pPr>
       <w:r>
-        <w:t>Practiced C++ fundame</w:t>
-      </w:r>
-      <w:r>
-        <w:t>ntals — object-oriented programming, data structures, and program logic — through structured exercises reviewed by senior developers.</w:t>
+        <w:t>Practiced C++ fundamentals — object-oriented programming, data structures, and program logic — through structured exercises reviewed by senior developers.</w:t>
       </w:r>
     </w:p>
     <w:p>
@@ -544,10 +642,7 @@
         <w:ind w:left="283"/>
       </w:pPr>
       <w:r>
-        <w:t>Debugged and revised code based on mentor feedback and code review, building systematic troubleshooting habits and a reada</w:t>
-      </w:r>
-      <w:r>
-        <w:t>ble coding style.</w:t>
+        <w:t>Debugged and revised code based on mentor feedback and code review, building systematic troubleshooting habits and a readable coding style.</w:t>
       </w:r>
     </w:p>
     <w:p>
@@ -642,58 +737,26 @@
           <w:bCs/>
           <w:color w:val="1B2A4A"/>
         </w:rPr>
-        <w:t>Web Development (TVTO</w:t>
-      </w:r>
-      <w:r>
-        <w:rPr>
-          <w:b/>
-          <w:bCs/>
-          <w:color w:val="1B2A4A"/>
-        </w:rPr>
-        <w:t xml:space="preserve">):  </w:t>
+        <w:t xml:space="preserve">Web Development (TVTO):  </w:t>
       </w:r>
       <w:hyperlink r:id="rId9">
         <w:r>
           <w:rPr>
-            <w:color w:val="1155CC"/>
-            <w:u w:val="single"/>
+            <w:rStyle w:val="Hyperlink"/>
           </w:rPr>
-          <w:t>Web Design Fundamentals (</w:t>
+          <w:t>Web Design Fun</w:t>
         </w:r>
         <w:r>
           <w:rPr>
-            <w:color w:val="1155CC"/>
-            <w:u w:val="single"/>
+            <w:rStyle w:val="Hyperlink"/>
           </w:rPr>
-          <w:t>H</w:t>
+          <w:t>d</w:t>
         </w:r>
         <w:r>
           <w:rPr>
-            <w:color w:val="1155CC"/>
-            <w:u w:val="single"/>
+            <w:rStyle w:val="Hyperlink"/>
           </w:rPr>
-          <w:t>T</w:t>
-        </w:r>
-        <w:r>
-          <w:rPr>
-            <w:color w:val="1155CC"/>
-            <w:u w:val="single"/>
-          </w:rPr>
-          <w:t>M</w:t>
-        </w:r>
-        <w:r>
-          <w:rPr>
-            <w:color w:val="1155CC"/>
-            <w:u w:val="single"/>
-          </w:rPr>
-          <w:t>L</w:t>
-        </w:r>
-        <w:r>
-          <w:rPr>
-            <w:color w:val="1155CC"/>
-            <w:u w:val="single"/>
-          </w:rPr>
-          <w:t>5, CSS3)</w:t>
+          <w:t>amentals (HTML5, CSS3)</w:t>
         </w:r>
       </w:hyperlink>
       <w:r>
@@ -715,70 +778,58 @@
           <w:rPr>
             <w:rStyle w:val="Hyperlink"/>
           </w:rPr>
-          <w:t>Applied Web Development (HTML, CSS, JavaSc</w:t>
+          <w:t>Applied Web Development (HTML, CSS, JavaScript)</w:t>
         </w:r>
+      </w:hyperlink>
+      <w:bookmarkStart w:id="0" w:name="_GoBack"/>
+      <w:bookmarkEnd w:id="0"/>
+    </w:p>
+    <w:p>
+      <w:pPr>
+        <w:spacing w:after="30"/>
+      </w:pPr>
+      <w:r>
+        <w:rPr>
+          <w:b/>
+          <w:bCs/>
+          <w:color w:val="1B2A4A"/>
+        </w:rPr>
+        <w:t>Web Development (</w:t>
+      </w:r>
+      <w:proofErr w:type="spellStart"/>
+      <w:r>
+        <w:rPr>
+          <w:b/>
+          <w:bCs/>
+          <w:color w:val="1B2A4A"/>
+        </w:rPr>
+        <w:t>Finca</w:t>
+      </w:r>
+      <w:proofErr w:type="spellEnd"/>
+      <w:r>
+        <w:rPr>
+          <w:b/>
+          <w:bCs/>
+          <w:color w:val="1B2A4A"/>
+        </w:rPr>
+        <w:t xml:space="preserve"> Academy):  </w:t>
+      </w:r>
+      <w:hyperlink r:id="rId12">
         <w:r>
           <w:rPr>
             <w:rStyle w:val="Hyperlink"/>
           </w:rPr>
-          <w:t>r</w:t>
+          <w:t>HTML &amp; CSS</w:t>
         </w:r>
+      </w:hyperlink>
+      <w:r>
+        <w:t>;</w:t>
+      </w:r>
+      <w:hyperlink r:id="rId13">
         <w:r>
           <w:rPr>
             <w:rStyle w:val="Hyperlink"/>
           </w:rPr>
-          <w:t>ipt)</w:t>
-        </w:r>
-      </w:hyperlink>
-    </w:p>
-    <w:p>
-      <w:pPr>
-        <w:spacing w:after="30"/>
-      </w:pPr>
-      <w:r>
-        <w:rPr>
-          <w:b/>
-          <w:bCs/>
-          <w:color w:val="1B2A4A"/>
-        </w:rPr>
-        <w:t>Web Development (</w:t>
-      </w:r>
-      <w:proofErr w:type="spellStart"/>
-      <w:r>
-        <w:rPr>
-          <w:b/>
-          <w:bCs/>
-          <w:color w:val="1B2A4A"/>
-        </w:rPr>
-        <w:t>Finca</w:t>
-      </w:r>
-      <w:proofErr w:type="spellEnd"/>
-      <w:r>
-        <w:rPr>
-          <w:b/>
-          <w:bCs/>
-          <w:color w:val="1B2A4A"/>
-        </w:rPr>
-        <w:t xml:space="preserve"> Academy):  </w:t>
-      </w:r>
-      <w:hyperlink r:id="rId12">
-        <w:r>
-          <w:rPr>
-            <w:color w:val="1155CC"/>
-            <w:u w:val="single"/>
-          </w:rPr>
-          <w:t>HTML &amp; CSS</w:t>
-        </w:r>
-      </w:hyperlink>
-      <w:r>
-        <w:t>;</w:t>
-      </w:r>
-      <w:hyperlink r:id="rId13">
-        <w:r>
-          <w:rPr>
-            <w:color w:val="1155CC"/>
-            <w:u w:val="single"/>
-          </w:rPr>
           <w:t xml:space="preserve"> Advanced CSS</w:t>
         </w:r>
       </w:hyperlink>
@@ -788,14 +839,11 @@
       <w:hyperlink r:id="rId14">
         <w:r>
           <w:rPr>
-            <w:color w:val="1155CC"/>
-            <w:u w:val="single"/>
+            <w:rStyle w:val="Hyperlink"/>
           </w:rPr>
           <w:t>JavaScript</w:t>
         </w:r>
       </w:hyperlink>
-      <w:bookmarkStart w:id="0" w:name="_GoBack"/>
-      <w:bookmarkEnd w:id="0"/>
     </w:p>
     <w:p>
       <w:pPr>
@@ -823,49 +871,15 @@
       <w:hyperlink r:id="rId16">
         <w:r>
           <w:rPr>
-            <w:color w:val="1155CC"/>
-            <w:u w:val="single"/>
+            <w:rStyle w:val="Hyperlink"/>
           </w:rPr>
-          <w:t>ICDL Lev</w:t>
-        </w:r>
-        <w:r>
-          <w:rPr>
-            <w:color w:val="1155CC"/>
-            <w:u w:val="single"/>
-          </w:rPr>
-          <w:t>e</w:t>
-        </w:r>
-        <w:r>
-          <w:rPr>
-            <w:color w:val="1155CC"/>
-            <w:u w:val="single"/>
-          </w:rPr>
-          <w:t>l 1</w:t>
+          <w:t>ICDL Level 1</w:t>
         </w:r>
       </w:hyperlink>
       <w:r>
         <w:t>;</w:t>
       </w:r>
       <w:hyperlink r:id="rId17">
-        <w:r>
-          <w:rPr>
-            <w:color w:val="1155CC"/>
-            <w:u w:val="single"/>
-          </w:rPr>
-          <w:t xml:space="preserve"> ICDL User</w:t>
-        </w:r>
-      </w:hyperlink>
-      <w:r>
-        <w:t>;</w:t>
-      </w:r>
-      <w:hyperlink r:id="rId18">
-        <w:r>
-          <w:rPr>
-            <w:color w:val="1155CC"/>
-            <w:u w:val="single"/>
-          </w:rPr>
-          <w:t xml:space="preserve"> Fundamentals of</w:t>
-        </w:r>
         <w:r>
           <w:rPr>
             <w:color w:val="1155CC"/>
@@ -875,36 +889,38 @@
         </w:r>
         <w:r>
           <w:rPr>
-            <w:color w:val="1155CC"/>
-            <w:u w:val="single"/>
+            <w:rStyle w:val="Hyperlink"/>
           </w:rPr>
-          <w:t>Robotics</w:t>
+          <w:t>ICDL User</w:t>
         </w:r>
       </w:hyperlink>
       <w:r>
-        <w:t xml:space="preserve">; </w:t>
-      </w:r>
-      <w:hyperlink r:id="rId19">
+        <w:t>;</w:t>
+      </w:r>
+      <w:hyperlink r:id="rId18">
         <w:r>
           <w:rPr>
             <w:color w:val="1155CC"/>
             <w:u w:val="single"/>
           </w:rPr>
-          <w:t>Adobe Photosh</w:t>
+          <w:t xml:space="preserve"> </w:t>
         </w:r>
         <w:r>
           <w:rPr>
-            <w:color w:val="1155CC"/>
-            <w:u w:val="single"/>
+            <w:rStyle w:val="Hyperlink"/>
           </w:rPr>
-          <w:t>o</w:t>
+          <w:t>Fundamentals of Robotics</w:t>
         </w:r>
+      </w:hyperlink>
+      <w:r>
+        <w:t xml:space="preserve">; </w:t>
+      </w:r>
+      <w:hyperlink r:id="rId19">
         <w:r>
           <w:rPr>
-            <w:color w:val="1155CC"/>
-            <w:u w:val="single"/>
+            <w:rStyle w:val="Hyperlink"/>
           </w:rPr>
-          <w:t>p Operator</w:t>
+          <w:t>Adobe Photoshop Operator</w:t>
         </w:r>
       </w:hyperlink>
     </w:p>
@@ -964,10 +980,7 @@
         <w:ind w:left="283"/>
       </w:pPr>
       <w:r>
-        <w:t>9</w:t>
-      </w:r>
-      <w:r>
-        <w:t>th Place, National Mechanical Engineering Design Olympiad, Iran — 2025</w:t>
+        <w:t>9th Place, National Mechanical Engineering Design Olympiad, Iran — 2025</w:t>
       </w:r>
     </w:p>
     <w:p>
@@ -1022,10 +1035,7 @@
       </w:r>
       <w:proofErr w:type="gramEnd"/>
       <w:r>
-        <w:t xml:space="preserve">  English (Upper-Int</w:t>
-      </w:r>
-      <w:r>
-        <w:t>ermediate, B2)  |</w:t>
+        <w:t xml:space="preserve">  English (Upper-Intermediate, B2)  |</w:t>
       </w:r>
     </w:p>
     <w:sectPr>

</xml_diff>